<commit_message>
Fix: Show Team Members in Faculty Project Review
</commit_message>
<xml_diff>
--- a/changes to make and log.docx
+++ b/changes to make and log.docx
@@ -481,7 +481,6 @@
         <w:rPr>
           <w:noProof/>
         </w:rPr>
-        <w:lastRenderedPageBreak/>
         <w:drawing>
           <wp:inline distT="0" distB="0" distL="0" distR="0">
             <wp:extent cx="5337140" cy="2872224"/>
@@ -559,6 +558,7 @@
         <w:rPr>
           <w:noProof/>
         </w:rPr>
+        <w:lastRenderedPageBreak/>
         <w:drawing>
           <wp:inline distT="0" distB="0" distL="0" distR="0">
             <wp:extent cx="6137925" cy="3105159"/>
@@ -688,7 +688,6 @@
         <w:jc w:val="both"/>
       </w:pPr>
       <w:r>
-        <w:lastRenderedPageBreak/>
         <w:t>Faculty name , branch name ,</w:t>
       </w:r>
       <w:proofErr w:type="spellStart"/>
@@ -907,6 +906,7 @@
         </w:rPr>
       </w:pPr>
       <w:r>
+        <w:lastRenderedPageBreak/>
         <w:t xml:space="preserve">This error is coming when we are trying to reassign the faculty to the student </w:t>
       </w:r>
       <w:r>
@@ -998,7 +998,6 @@
         <w:rPr>
           <w:noProof/>
         </w:rPr>
-        <w:lastRenderedPageBreak/>
         <w:drawing>
           <wp:inline distT="0" distB="0" distL="0" distR="0">
             <wp:extent cx="5943600" cy="2806539"/>
@@ -1253,6 +1252,7 @@
       </w:pPr>
       <w:proofErr w:type="gramStart"/>
       <w:r>
+        <w:lastRenderedPageBreak/>
         <w:t>set</w:t>
       </w:r>
       <w:proofErr w:type="gramEnd"/>
@@ -1328,7 +1328,6 @@
         <w:rPr>
           <w:noProof/>
         </w:rPr>
-        <w:lastRenderedPageBreak/>
         <w:drawing>
           <wp:inline distT="0" distB="0" distL="0" distR="0">
             <wp:extent cx="5943600" cy="2795161"/>
@@ -1890,59 +1889,59 @@
       </w:r>
       <w:proofErr w:type="spellEnd"/>
       <w:r>
-        <w:t xml:space="preserve"> pages first. ================================================== PROJECT SUBMISSION WORKFLOW ================================================== Both project types must follow TWO STAGES: STAGE 1 = PROJECT PROPOSAL / INITIAL DOCUMENTS STAGE 2 = FINAL PROJECT SUBMISSION The student must complete and get Faculty Guide approval for Stage 1 before Stage 2 becomes available. ================================================== 1. OWN PROJECT IDEA </w:t>
+        <w:t xml:space="preserve"> pages first. ================================================== PROJECT SUBMISSION WORKFLOW ================================================== Both project types must follow TWO STAGES: STAGE 1 = PROJECT PROPOSAL / INITIAL DOCUMENTS STAGE 2 = FINAL PROJECT SUBMISSION The student must complete and get Faculty Guide approval for Stage 1 before Stage 2 becomes available. ================================================== 1. OWN PROJECT IDEA ================================================== Flow: Student submits own project idea ↓ Faculty Guide reviews proposal ↓ APPROVED → Student can start working REJECTED → Student edits/resubmits proposal ↓ After Faculty approval ↓ Student can work on project ↓ Student submits final project/code/files ↓ Faculty reviews final project ↓ Faculty APPROVED ↓ HOD review ↓ HOD APPROVED ↓ COMPLETED ================================================== 2. AVAILABLE TOPIC PROJECT ================================================== Flow: Student selects available topic ↓ Project proposal stage ↓ Faculty Guide reviews proposal ↓ APPROVED → Student can start working REJECTED → Student edits/resubmits proposal ↓ After Faculty approval ↓ Student can work on project ↓ Student submits final project/code/files ↓ Faculty reviews final project ↓ Faculty APPROVED ↓ HOD review ↓ HOD APPROVED ↓ COMPLETED ================================================== 3. STAGE 1 – REQUIRED PROJECT PROPOSAL DOCUMENTS ================================================== Before Faculty approval, Student must submit: 1. Project Synopsis 2. </w:t>
+      </w:r>
+      <w:proofErr w:type="gramStart"/>
+      <w:r>
+        <w:t>PowerPoint Presentation (PPT) 3.</w:t>
+      </w:r>
+      <w:proofErr w:type="gramEnd"/>
+      <w:r>
+        <w:t xml:space="preserve"> </w:t>
+      </w:r>
+      <w:proofErr w:type="gramStart"/>
+      <w:r>
+        <w:t>Problem Statement 4.</w:t>
+      </w:r>
+      <w:proofErr w:type="gramEnd"/>
+      <w:r>
+        <w:t xml:space="preserve"> </w:t>
+      </w:r>
+      <w:proofErr w:type="gramStart"/>
+      <w:r>
+        <w:t>Objectives 5.</w:t>
+      </w:r>
+      <w:proofErr w:type="gramEnd"/>
+      <w:r>
+        <w:t xml:space="preserve"> </w:t>
+      </w:r>
+      <w:proofErr w:type="gramStart"/>
+      <w:r>
+        <w:t>Literature Review 6.</w:t>
+      </w:r>
+      <w:proofErr w:type="gramEnd"/>
+      <w:r>
+        <w:t xml:space="preserve"> </w:t>
+      </w:r>
+      <w:proofErr w:type="gramStart"/>
+      <w:r>
+        <w:t>Proposed Methodology 7.</w:t>
+      </w:r>
+      <w:proofErr w:type="gramEnd"/>
+      <w:r>
+        <w:t xml:space="preserve"> System Design/Architecture - Architecture - Flowchart - ER Diagram - Use Case Diagram - Other relevant diagrams 8. </w:t>
+      </w:r>
+      <w:proofErr w:type="gramStart"/>
+      <w:r>
+        <w:t>Technology Stack 9.</w:t>
+      </w:r>
+      <w:proofErr w:type="gramEnd"/>
+      <w:r>
+        <w:t xml:space="preserve"> Future Work/Plan </w:t>
       </w:r>
       <w:r>
         <w:lastRenderedPageBreak/>
-        <w:t xml:space="preserve">================================================== Flow: Student submits own project idea ↓ Faculty Guide reviews proposal ↓ APPROVED → Student can start working REJECTED → Student edits/resubmits proposal ↓ After Faculty approval ↓ Student can work on project ↓ Student submits final project/code/files ↓ Faculty reviews final project ↓ Faculty APPROVED ↓ HOD review ↓ HOD APPROVED ↓ COMPLETED ================================================== 2. AVAILABLE TOPIC PROJECT ================================================== Flow: Student selects available topic ↓ Project proposal stage ↓ Faculty Guide reviews proposal ↓ APPROVED → Student can start working REJECTED → Student edits/resubmits proposal ↓ After Faculty approval ↓ Student can work on project ↓ Student submits final project/code/files ↓ Faculty reviews final project ↓ Faculty APPROVED ↓ HOD review ↓ HOD APPROVED ↓ COMPLETED ================================================== 3. STAGE 1 – REQUIRED PROJECT PROPOSAL DOCUMENTS ================================================== Before Faculty approval, Student must submit: 1. Project Synopsis 2. </w:t>
-      </w:r>
-      <w:proofErr w:type="gramStart"/>
-      <w:r>
-        <w:t>PowerPoint Presentation (PPT) 3.</w:t>
-      </w:r>
-      <w:proofErr w:type="gramEnd"/>
-      <w:r>
-        <w:t xml:space="preserve"> </w:t>
-      </w:r>
-      <w:proofErr w:type="gramStart"/>
-      <w:r>
-        <w:t>Problem Statement 4.</w:t>
-      </w:r>
-      <w:proofErr w:type="gramEnd"/>
-      <w:r>
-        <w:t xml:space="preserve"> </w:t>
-      </w:r>
-      <w:proofErr w:type="gramStart"/>
-      <w:r>
-        <w:t>Objectives 5.</w:t>
-      </w:r>
-      <w:proofErr w:type="gramEnd"/>
-      <w:r>
-        <w:t xml:space="preserve"> </w:t>
-      </w:r>
-      <w:proofErr w:type="gramStart"/>
-      <w:r>
-        <w:t>Literature Review 6.</w:t>
-      </w:r>
-      <w:proofErr w:type="gramEnd"/>
-      <w:r>
-        <w:t xml:space="preserve"> </w:t>
-      </w:r>
-      <w:proofErr w:type="gramStart"/>
-      <w:r>
-        <w:t>Proposed Methodology 7.</w:t>
-      </w:r>
-      <w:proofErr w:type="gramEnd"/>
-      <w:r>
-        <w:t xml:space="preserve"> System Design/Architecture - Architecture - Flowchart - ER Diagram - Use Case Diagram - Other relevant diagrams 8. </w:t>
-      </w:r>
-      <w:proofErr w:type="gramStart"/>
-      <w:r>
-        <w:t>Technology Stack 9.</w:t>
-      </w:r>
-      <w:proofErr w:type="gramEnd"/>
-      <w:r>
-        <w:t xml:space="preserve"> Future Work/Plan These documents/details are part of the initial proposal and must be available to the Faculty Guide for review. ================================================== 4. STAGE 1 RESTRICTION ================================================== Before Faculty approves the proposal: Student MUST NOT be allowed to submit: - Project source code - </w:t>
+        <w:t xml:space="preserve">These documents/details are part of the initial proposal and must be available to the Faculty Guide for review. ================================================== 4. STAGE 1 RESTRICTION ================================================== Before Faculty approves the proposal: Student MUST NOT be allowed to submit: - Project source code - </w:t>
       </w:r>
       <w:proofErr w:type="spellStart"/>
       <w:r>
@@ -1974,11 +1973,7 @@
       </w:r>
       <w:proofErr w:type="spellEnd"/>
       <w:r>
-        <w:t xml:space="preserve"> rejection </w:t>
-      </w:r>
-      <w:r>
-        <w:lastRenderedPageBreak/>
-        <w:t xml:space="preserve">requires a rejection reason. After Faculty approval: Faculty ↓ HOD Review ↓ HOD APPROVED → COMPLETED HOD REJECTED → Student resubmits to HOD </w:t>
+        <w:t xml:space="preserve"> rejection requires a rejection reason. After Faculty approval: Faculty ↓ HOD Review ↓ HOD APPROVED → COMPLETED HOD REJECTED → Student resubmits to HOD </w:t>
       </w:r>
       <w:proofErr w:type="spellStart"/>
       <w:r>
@@ -2071,7 +2066,16 @@
         </w:tabs>
       </w:pPr>
       <w:r>
-        <w:t>Added Stage 1 fields: synopsis, pptFilePath, problemStatement, objectives, literatureReview, methodology, </w:t>
+        <w:lastRenderedPageBreak/>
+        <w:t>Added Stage 1 fields: synopsis, pptFilePath, problemStatement, objectives, </w:t>
+      </w:r>
+      <w:proofErr w:type="spellStart"/>
+      <w:r>
+        <w:t>literatureReview</w:t>
+      </w:r>
+      <w:proofErr w:type="spellEnd"/>
+      <w:r>
+        <w:t>, methodology, </w:t>
       </w:r>
       <w:proofErr w:type="spellStart"/>
       <w:r>
@@ -2254,7 +2258,6 @@
       <w:proofErr w:type="spellStart"/>
       <w:proofErr w:type="gramStart"/>
       <w:r>
-        <w:lastRenderedPageBreak/>
         <w:t>approveProposal</w:t>
       </w:r>
       <w:proofErr w:type="spellEnd"/>
@@ -2490,6 +2493,7 @@
       </w:pPr>
       <w:proofErr w:type="gramStart"/>
       <w:r>
+        <w:lastRenderedPageBreak/>
         <w:t>project-submit.html</w:t>
       </w:r>
       <w:proofErr w:type="gramEnd"/>
@@ -2582,7 +2586,6 @@
           <w:b/>
           <w:bCs/>
         </w:rPr>
-        <w:lastRenderedPageBreak/>
         <w:t>Faculty Tools:</w:t>
       </w:r>
     </w:p>
@@ -2857,9 +2860,578 @@
         </w:drawing>
       </w:r>
     </w:p>
+    <w:p>
+      <w:pPr>
+        <w:tabs>
+          <w:tab w:val="left" w:pos="2288"/>
+        </w:tabs>
+      </w:pPr>
+      <w:r>
+        <w:tab/>
+      </w:r>
+      <w:r>
+        <w:rPr>
+          <w:noProof/>
+        </w:rPr>
+        <w:drawing>
+          <wp:inline distT="0" distB="0" distL="0" distR="0">
+            <wp:extent cx="5943600" cy="2671136"/>
+            <wp:effectExtent l="19050" t="0" r="0" b="0"/>
+            <wp:docPr id="10" name="Picture 12"/>
+            <wp:cNvGraphicFramePr>
+              <a:graphicFrameLocks xmlns:a="http://schemas.openxmlformats.org/drawingml/2006/main" noChangeAspect="1"/>
+            </wp:cNvGraphicFramePr>
+            <a:graphic xmlns:a="http://schemas.openxmlformats.org/drawingml/2006/main">
+              <a:graphicData uri="http://schemas.openxmlformats.org/drawingml/2006/picture">
+                <pic:pic xmlns:pic="http://schemas.openxmlformats.org/drawingml/2006/picture">
+                  <pic:nvPicPr>
+                    <pic:cNvPr id="0" name="Picture 12"/>
+                    <pic:cNvPicPr>
+                      <a:picLocks noChangeAspect="1" noChangeArrowheads="1"/>
+                    </pic:cNvPicPr>
+                  </pic:nvPicPr>
+                  <pic:blipFill>
+                    <a:blip r:embed="rId20" cstate="print"/>
+                    <a:srcRect/>
+                    <a:stretch>
+                      <a:fillRect/>
+                    </a:stretch>
+                  </pic:blipFill>
+                  <pic:spPr bwMode="auto">
+                    <a:xfrm>
+                      <a:off x="0" y="0"/>
+                      <a:ext cx="5943600" cy="2671136"/>
+                    </a:xfrm>
+                    <a:prstGeom prst="rect">
+                      <a:avLst/>
+                    </a:prstGeom>
+                    <a:noFill/>
+                    <a:ln w="9525">
+                      <a:noFill/>
+                      <a:miter lim="800000"/>
+                      <a:headEnd/>
+                      <a:tailEnd/>
+                    </a:ln>
+                  </pic:spPr>
+                </pic:pic>
+              </a:graphicData>
+            </a:graphic>
+          </wp:inline>
+        </w:drawing>
+      </w:r>
+    </w:p>
+    <w:p/>
+    <w:p>
+      <w:pPr>
+        <w:tabs>
+          <w:tab w:val="left" w:pos="2110"/>
+        </w:tabs>
+      </w:pPr>
+      <w:r>
+        <w:tab/>
+        <w:t xml:space="preserve">The faculty will only see the details of the student and student project that are under them like here student cs2 guide is </w:t>
+      </w:r>
+      <w:proofErr w:type="spellStart"/>
+      <w:r>
+        <w:t>some one</w:t>
+      </w:r>
+      <w:proofErr w:type="spellEnd"/>
+      <w:r>
+        <w:t xml:space="preserve"> else but the student cs2 project data is </w:t>
+      </w:r>
+      <w:proofErr w:type="spellStart"/>
+      <w:r>
+        <w:t>visiable</w:t>
+      </w:r>
+      <w:proofErr w:type="spellEnd"/>
+      <w:r>
+        <w:t xml:space="preserve"> here I just want to remove this thing as faculty can only </w:t>
+      </w:r>
+      <w:proofErr w:type="spellStart"/>
+      <w:r>
+        <w:t>only</w:t>
+      </w:r>
+      <w:proofErr w:type="spellEnd"/>
+      <w:r>
+        <w:t xml:space="preserve"> see the project of student whose guide is that faculty not others.</w:t>
+      </w:r>
+    </w:p>
+    <w:p>
+      <w:pPr>
+        <w:tabs>
+          <w:tab w:val="left" w:pos="2110"/>
+        </w:tabs>
+      </w:pPr>
+    </w:p>
+    <w:p>
+      <w:pPr>
+        <w:tabs>
+          <w:tab w:val="left" w:pos="2110"/>
+        </w:tabs>
+      </w:pPr>
+    </w:p>
+    <w:p>
+      <w:pPr>
+        <w:tabs>
+          <w:tab w:val="left" w:pos="2110"/>
+        </w:tabs>
+      </w:pPr>
+    </w:p>
+    <w:p>
+      <w:pPr>
+        <w:tabs>
+          <w:tab w:val="left" w:pos="2110"/>
+        </w:tabs>
+      </w:pPr>
+    </w:p>
+    <w:p>
+      <w:pPr>
+        <w:tabs>
+          <w:tab w:val="left" w:pos="2110"/>
+        </w:tabs>
+      </w:pPr>
+    </w:p>
+    <w:p>
+      <w:pPr>
+        <w:tabs>
+          <w:tab w:val="left" w:pos="2110"/>
+        </w:tabs>
+      </w:pPr>
+    </w:p>
+    <w:p>
+      <w:pPr>
+        <w:tabs>
+          <w:tab w:val="left" w:pos="2110"/>
+        </w:tabs>
+      </w:pPr>
+      <w:r>
+        <w:rPr>
+          <w:noProof/>
+        </w:rPr>
+        <w:lastRenderedPageBreak/>
+        <w:drawing>
+          <wp:inline distT="0" distB="0" distL="0" distR="0">
+            <wp:extent cx="6858000" cy="3065432"/>
+            <wp:effectExtent l="19050" t="0" r="0" b="0"/>
+            <wp:docPr id="13" name="Picture 15"/>
+            <wp:cNvGraphicFramePr>
+              <a:graphicFrameLocks xmlns:a="http://schemas.openxmlformats.org/drawingml/2006/main" noChangeAspect="1"/>
+            </wp:cNvGraphicFramePr>
+            <a:graphic xmlns:a="http://schemas.openxmlformats.org/drawingml/2006/main">
+              <a:graphicData uri="http://schemas.openxmlformats.org/drawingml/2006/picture">
+                <pic:pic xmlns:pic="http://schemas.openxmlformats.org/drawingml/2006/picture">
+                  <pic:nvPicPr>
+                    <pic:cNvPr id="0" name="Picture 15"/>
+                    <pic:cNvPicPr>
+                      <a:picLocks noChangeAspect="1" noChangeArrowheads="1"/>
+                    </pic:cNvPicPr>
+                  </pic:nvPicPr>
+                  <pic:blipFill>
+                    <a:blip r:embed="rId21" cstate="print"/>
+                    <a:srcRect/>
+                    <a:stretch>
+                      <a:fillRect/>
+                    </a:stretch>
+                  </pic:blipFill>
+                  <pic:spPr bwMode="auto">
+                    <a:xfrm>
+                      <a:off x="0" y="0"/>
+                      <a:ext cx="6858000" cy="3065432"/>
+                    </a:xfrm>
+                    <a:prstGeom prst="rect">
+                      <a:avLst/>
+                    </a:prstGeom>
+                    <a:noFill/>
+                    <a:ln w="9525">
+                      <a:noFill/>
+                      <a:miter lim="800000"/>
+                      <a:headEnd/>
+                      <a:tailEnd/>
+                    </a:ln>
+                  </pic:spPr>
+                </pic:pic>
+              </a:graphicData>
+            </a:graphic>
+          </wp:inline>
+        </w:drawing>
+      </w:r>
+    </w:p>
+    <w:p>
+      <w:pPr>
+        <w:tabs>
+          <w:tab w:val="left" w:pos="2540"/>
+        </w:tabs>
+      </w:pPr>
+      <w:r>
+        <w:t>The auto-</w:t>
+      </w:r>
+      <w:proofErr w:type="spellStart"/>
+      <w:r>
+        <w:t>assing</w:t>
+      </w:r>
+      <w:proofErr w:type="spellEnd"/>
+      <w:r>
+        <w:t xml:space="preserve"> all should work automatically when the selection period ended for selecting the faculty that was created by the </w:t>
+      </w:r>
+      <w:proofErr w:type="spellStart"/>
+      <w:r>
+        <w:t>hod</w:t>
+      </w:r>
+      <w:proofErr w:type="spellEnd"/>
+      <w:r>
+        <w:t xml:space="preserve"> of branch.</w:t>
+      </w:r>
+    </w:p>
+    <w:p>
+      <w:pPr>
+        <w:tabs>
+          <w:tab w:val="left" w:pos="2110"/>
+        </w:tabs>
+      </w:pPr>
+    </w:p>
+    <w:p>
+      <w:pPr>
+        <w:tabs>
+          <w:tab w:val="left" w:pos="2110"/>
+        </w:tabs>
+      </w:pPr>
+      <w:r>
+        <w:rPr>
+          <w:noProof/>
+        </w:rPr>
+        <w:drawing>
+          <wp:inline distT="0" distB="0" distL="0" distR="0">
+            <wp:extent cx="6858000" cy="3064213"/>
+            <wp:effectExtent l="19050" t="0" r="0" b="0"/>
+            <wp:docPr id="24" name="Picture 24"/>
+            <wp:cNvGraphicFramePr>
+              <a:graphicFrameLocks xmlns:a="http://schemas.openxmlformats.org/drawingml/2006/main" noChangeAspect="1"/>
+            </wp:cNvGraphicFramePr>
+            <a:graphic xmlns:a="http://schemas.openxmlformats.org/drawingml/2006/main">
+              <a:graphicData uri="http://schemas.openxmlformats.org/drawingml/2006/picture">
+                <pic:pic xmlns:pic="http://schemas.openxmlformats.org/drawingml/2006/picture">
+                  <pic:nvPicPr>
+                    <pic:cNvPr id="0" name="Picture 24"/>
+                    <pic:cNvPicPr>
+                      <a:picLocks noChangeAspect="1" noChangeArrowheads="1"/>
+                    </pic:cNvPicPr>
+                  </pic:nvPicPr>
+                  <pic:blipFill>
+                    <a:blip r:embed="rId22" cstate="print"/>
+                    <a:srcRect/>
+                    <a:stretch>
+                      <a:fillRect/>
+                    </a:stretch>
+                  </pic:blipFill>
+                  <pic:spPr bwMode="auto">
+                    <a:xfrm>
+                      <a:off x="0" y="0"/>
+                      <a:ext cx="6858000" cy="3064213"/>
+                    </a:xfrm>
+                    <a:prstGeom prst="rect">
+                      <a:avLst/>
+                    </a:prstGeom>
+                    <a:noFill/>
+                    <a:ln w="9525">
+                      <a:noFill/>
+                      <a:miter lim="800000"/>
+                      <a:headEnd/>
+                      <a:tailEnd/>
+                    </a:ln>
+                  </pic:spPr>
+                </pic:pic>
+              </a:graphicData>
+            </a:graphic>
+          </wp:inline>
+        </w:drawing>
+      </w:r>
+    </w:p>
+    <w:p>
+      <w:pPr>
+        <w:tabs>
+          <w:tab w:val="left" w:pos="2110"/>
+        </w:tabs>
+      </w:pPr>
+      <w:r>
+        <w:t xml:space="preserve">Here I want to add the team member </w:t>
+      </w:r>
+      <w:proofErr w:type="spellStart"/>
+      <w:r>
+        <w:t>ditales</w:t>
+      </w:r>
+      <w:proofErr w:type="spellEnd"/>
+      <w:r>
+        <w:t xml:space="preserve"> </w:t>
+      </w:r>
+      <w:r>
+        <w:t xml:space="preserve">that will depend upon the team member capacity min/max that the faculty (who is our guide that we chose or </w:t>
+      </w:r>
+      <w:proofErr w:type="gramStart"/>
+      <w:r>
+        <w:t>got )</w:t>
+      </w:r>
+      <w:proofErr w:type="gramEnd"/>
+      <w:r>
+        <w:t xml:space="preserve"> has listed on the project topic .</w:t>
+      </w:r>
+    </w:p>
+    <w:p>
+      <w:pPr>
+        <w:tabs>
+          <w:tab w:val="left" w:pos="2110"/>
+        </w:tabs>
+      </w:pPr>
+      <w:proofErr w:type="gramStart"/>
+      <w:r>
+        <w:t>team</w:t>
+      </w:r>
+      <w:proofErr w:type="gramEnd"/>
+      <w:r>
+        <w:t xml:space="preserve"> member </w:t>
+      </w:r>
+      <w:proofErr w:type="spellStart"/>
+      <w:r>
+        <w:t>ditales</w:t>
+      </w:r>
+      <w:proofErr w:type="spellEnd"/>
+      <w:r>
+        <w:t>------------</w:t>
+      </w:r>
+    </w:p>
+    <w:p>
+      <w:pPr>
+        <w:tabs>
+          <w:tab w:val="left" w:pos="2110"/>
+        </w:tabs>
+      </w:pPr>
+      <w:r>
+        <w:t xml:space="preserve">full name ,email(0232cs013@niet.co.in),ERPID(like 0231cs013 where </w:t>
+      </w:r>
+      <w:proofErr w:type="spellStart"/>
+      <w:r>
+        <w:t>cs</w:t>
+      </w:r>
+      <w:proofErr w:type="spellEnd"/>
+      <w:r>
+        <w:t xml:space="preserve"> is the branch name and 0231 23 means year we got admission on and 013 is the unique number of student /users),</w:t>
+      </w:r>
+      <w:proofErr w:type="spellStart"/>
+      <w:r>
+        <w:t>rollnumber</w:t>
+      </w:r>
+      <w:proofErr w:type="spellEnd"/>
+      <w:r>
+        <w:t xml:space="preserve">(2301330120_ _ _  the 3 _ will be unique that is our </w:t>
+      </w:r>
+      <w:proofErr w:type="spellStart"/>
+      <w:r>
+        <w:t>rollnumber</w:t>
+      </w:r>
+      <w:proofErr w:type="spellEnd"/>
+      <w:r>
+        <w:t xml:space="preserve"> like 2301330120117 here 117 is the unique number for each student  )his/her contribution on the project or what is the role in there project </w:t>
+      </w:r>
+    </w:p>
+    <w:p>
+      <w:pPr>
+        <w:tabs>
+          <w:tab w:val="left" w:pos="2110"/>
+        </w:tabs>
+      </w:pPr>
+    </w:p>
+    <w:p>
+      <w:pPr>
+        <w:pStyle w:val="NormalWeb"/>
+      </w:pPr>
+      <w:proofErr w:type="spellStart"/>
+      <w:proofErr w:type="gramStart"/>
+      <w:r>
+        <w:t>i</w:t>
+      </w:r>
+      <w:proofErr w:type="spellEnd"/>
+      <w:proofErr w:type="gramEnd"/>
+      <w:r>
+        <w:t xml:space="preserve"> </w:t>
+      </w:r>
+      <w:proofErr w:type="spellStart"/>
+      <w:r>
+        <w:t>ment</w:t>
+      </w:r>
+      <w:proofErr w:type="spellEnd"/>
+      <w:r>
+        <w:t xml:space="preserve"> to say this </w:t>
+      </w:r>
+      <w:proofErr w:type="spellStart"/>
+      <w:r>
+        <w:t>shouldnot</w:t>
+      </w:r>
+      <w:proofErr w:type="spellEnd"/>
+      <w:r>
+        <w:t xml:space="preserve"> come Selection Period Has Ended</w:t>
+      </w:r>
+    </w:p>
+    <w:p>
+      <w:pPr>
+        <w:pStyle w:val="NormalWeb"/>
+      </w:pPr>
+      <w:r>
+        <w:t>The guide selection deadline has passed. Please contact your HOD for guide assignment</w:t>
+      </w:r>
+    </w:p>
+    <w:p>
+      <w:pPr>
+        <w:pStyle w:val="NormalWeb"/>
+      </w:pPr>
+      <w:proofErr w:type="gramStart"/>
+      <w:r>
+        <w:t>the</w:t>
+      </w:r>
+      <w:proofErr w:type="gramEnd"/>
+      <w:r>
+        <w:t xml:space="preserve"> student will get the guide the </w:t>
+      </w:r>
+      <w:proofErr w:type="spellStart"/>
+      <w:r>
+        <w:t>automaticaly</w:t>
+      </w:r>
+      <w:proofErr w:type="spellEnd"/>
+    </w:p>
+    <w:p>
+      <w:pPr>
+        <w:tabs>
+          <w:tab w:val="left" w:pos="2110"/>
+        </w:tabs>
+      </w:pPr>
+      <w:r>
+        <w:rPr>
+          <w:noProof/>
+        </w:rPr>
+        <w:drawing>
+          <wp:inline distT="0" distB="0" distL="0" distR="0">
+            <wp:extent cx="6858000" cy="2158409"/>
+            <wp:effectExtent l="19050" t="0" r="0" b="0"/>
+            <wp:docPr id="27" name="Picture 27"/>
+            <wp:cNvGraphicFramePr>
+              <a:graphicFrameLocks xmlns:a="http://schemas.openxmlformats.org/drawingml/2006/main" noChangeAspect="1"/>
+            </wp:cNvGraphicFramePr>
+            <a:graphic xmlns:a="http://schemas.openxmlformats.org/drawingml/2006/main">
+              <a:graphicData uri="http://schemas.openxmlformats.org/drawingml/2006/picture">
+                <pic:pic xmlns:pic="http://schemas.openxmlformats.org/drawingml/2006/picture">
+                  <pic:nvPicPr>
+                    <pic:cNvPr id="0" name="Picture 27"/>
+                    <pic:cNvPicPr>
+                      <a:picLocks noChangeAspect="1" noChangeArrowheads="1"/>
+                    </pic:cNvPicPr>
+                  </pic:nvPicPr>
+                  <pic:blipFill>
+                    <a:blip r:embed="rId23" cstate="print"/>
+                    <a:srcRect/>
+                    <a:stretch>
+                      <a:fillRect/>
+                    </a:stretch>
+                  </pic:blipFill>
+                  <pic:spPr bwMode="auto">
+                    <a:xfrm>
+                      <a:off x="0" y="0"/>
+                      <a:ext cx="6858000" cy="2158409"/>
+                    </a:xfrm>
+                    <a:prstGeom prst="rect">
+                      <a:avLst/>
+                    </a:prstGeom>
+                    <a:noFill/>
+                    <a:ln w="9525">
+                      <a:noFill/>
+                      <a:miter lim="800000"/>
+                      <a:headEnd/>
+                      <a:tailEnd/>
+                    </a:ln>
+                  </pic:spPr>
+                </pic:pic>
+              </a:graphicData>
+            </a:graphic>
+          </wp:inline>
+        </w:drawing>
+      </w:r>
+    </w:p>
+    <w:p>
+      <w:pPr>
+        <w:tabs>
+          <w:tab w:val="left" w:pos="2110"/>
+        </w:tabs>
+      </w:pPr>
+      <w:r>
+        <w:t xml:space="preserve">The team member </w:t>
+      </w:r>
+      <w:proofErr w:type="spellStart"/>
+      <w:r>
+        <w:t>ditales</w:t>
+      </w:r>
+      <w:proofErr w:type="spellEnd"/>
+      <w:r>
+        <w:t xml:space="preserve"> are not displaying to the faculty when he goes to do project </w:t>
+      </w:r>
+      <w:proofErr w:type="spellStart"/>
+      <w:r>
+        <w:t>approva</w:t>
+      </w:r>
+      <w:proofErr w:type="spellEnd"/>
+      <w:r>
+        <w:t xml:space="preserve"> and rejection process </w:t>
+      </w:r>
+    </w:p>
+    <w:p>
+      <w:pPr>
+        <w:tabs>
+          <w:tab w:val="left" w:pos="2110"/>
+        </w:tabs>
+      </w:pPr>
+      <w:r>
+        <w:t xml:space="preserve">2.) the </w:t>
+      </w:r>
+      <w:proofErr w:type="spellStart"/>
+      <w:r>
+        <w:t>erp</w:t>
+      </w:r>
+      <w:proofErr w:type="spellEnd"/>
+      <w:r>
+        <w:t xml:space="preserve"> and </w:t>
+      </w:r>
+      <w:proofErr w:type="spellStart"/>
+      <w:r>
+        <w:t>rollnumber</w:t>
+      </w:r>
+      <w:proofErr w:type="spellEnd"/>
+      <w:r>
+        <w:t xml:space="preserve"> to different thing and they are not here as when the admin create the user at that time he should get the place where he can give this data or this thing can be done by the student or you can say user </w:t>
+      </w:r>
+      <w:proofErr w:type="spellStart"/>
+      <w:r>
+        <w:t>it self</w:t>
+      </w:r>
+      <w:proofErr w:type="spellEnd"/>
+      <w:r>
+        <w:t xml:space="preserve"> that he will make his profile up to date and will update or view all his </w:t>
+      </w:r>
+      <w:proofErr w:type="spellStart"/>
+      <w:r>
+        <w:t>cridintials</w:t>
+      </w:r>
+      <w:proofErr w:type="spellEnd"/>
+      <w:r>
+        <w:t xml:space="preserve"> this implementation  goes to all faculty </w:t>
+      </w:r>
+      <w:proofErr w:type="spellStart"/>
+      <w:r>
+        <w:t>hod</w:t>
+      </w:r>
+      <w:proofErr w:type="spellEnd"/>
+      <w:r>
+        <w:t xml:space="preserve"> also.</w:t>
+      </w:r>
+    </w:p>
     <w:sectPr>
       <w:pgSz w:w="12240" w:h="15840"/>
-      <w:pgMar w:top="1440" w:right="1440" w:bottom="1440" w:left="1440" w:header="708" w:footer="708" w:gutter="0"/>
+      <w:pgMar w:top="720" w:right="720" w:bottom="720" w:left="720" w:header="708" w:footer="708" w:gutter="0"/>
       <w:cols w:space="708"/>
       <w:docGrid w:linePitch="360"/>
     </w:sectPr>
@@ -3628,7 +4200,7 @@
   <a:extraClrSchemeLst/>
   <a:extLst>
     <a:ext uri="{05A4C25C-085E-4340-85A3-A5531E510DB2}">
-      <thm15:themeFamily xmlns="" xmlns:thm15="http://schemas.microsoft.com/office/thememl/2012/main" name="Office Theme" id="{62F939B6-93AF-4DB8-9C6B-D6C7DFDC589F}" vid="{4A3C46E8-61CC-4603-A589-7422A47A8E4A}"/>
+      <thm15:themeFamily xmlns:thm15="http://schemas.microsoft.com/office/thememl/2012/main" xmlns="" name="Office Theme" id="{62F939B6-93AF-4DB8-9C6B-D6C7DFDC589F}" vid="{4A3C46E8-61CC-4603-A589-7422A47A8E4A}"/>
     </a:ext>
   </a:extLst>
 </a:theme>

</xml_diff>